<commit_message>
clarified some items in the maker guide
</commit_message>
<xml_diff>
--- a/Documentation/Working_Documents/Shrub_Hub_Maker_Guide.docx
+++ b/Documentation/Working_Documents/Shrub_Hub_Maker_Guide.docx
@@ -1903,7 +1903,7 @@
                 <w:noProof/>
                 <w:webHidden/>
               </w:rPr>
-              <w:t>11</w:t>
+              <w:t>12</w:t>
             </w:r>
             <w:r>
               <w:rPr>
@@ -1976,7 +1976,7 @@
                 <w:noProof/>
                 <w:webHidden/>
               </w:rPr>
-              <w:t>13</w:t>
+              <w:t>14</w:t>
             </w:r>
             <w:r>
               <w:rPr>
@@ -2049,7 +2049,7 @@
                 <w:noProof/>
                 <w:webHidden/>
               </w:rPr>
-              <w:t>14</w:t>
+              <w:t>15</w:t>
             </w:r>
             <w:r>
               <w:rPr>
@@ -2078,6 +2078,7 @@
       </w:pPr>
       <w:bookmarkStart w:id="1" w:name="_Toc222389379"/>
       <w:r>
+        <w:lastRenderedPageBreak/>
         <w:t>Maker Checklist</w:t>
       </w:r>
       <w:bookmarkEnd w:id="1"/>
@@ -2623,6 +2624,60 @@
           <w:lang w:val="en-US"/>
         </w:rPr>
         <w:t>”</w:t>
+      </w:r>
+    </w:p>
+    <w:p>
+      <w:pPr>
+        <w:pStyle w:val="Heading2"/>
+        <w:rPr>
+          <w:lang w:val="en-US"/>
+        </w:rPr>
+      </w:pPr>
+      <w:r>
+        <w:rPr>
+          <w:lang w:val="en-US"/>
+        </w:rPr>
+        <w:t>Component Sourcing Notes</w:t>
+      </w:r>
+    </w:p>
+    <w:p>
+      <w:pPr>
+        <w:rPr>
+          <w:lang w:val="en-US"/>
+        </w:rPr>
+      </w:pPr>
+      <w:r>
+        <w:rPr>
+          <w:lang w:val="en-US"/>
+        </w:rPr>
+        <w:t>The 3-to-1 Switch Adapter is designed for mono audio cables with an outer diameter of 3 mm like the ones specified in the Bill of Materials. Cables with larger diameters may not work and may cause the enclosure to break.</w:t>
+      </w:r>
+    </w:p>
+    <w:p>
+      <w:pPr>
+        <w:rPr>
+          <w:lang w:val="en-US"/>
+        </w:rPr>
+      </w:pPr>
+      <w:r>
+        <w:rPr>
+          <w:lang w:val="en-US"/>
+        </w:rPr>
+        <w:t xml:space="preserve">The 3-to-1 Switch Adapter is designed for the TRRS terminal block sourced from Amazon. A similar part is available from </w:t>
+      </w:r>
+      <w:proofErr w:type="gramStart"/>
+      <w:r>
+        <w:rPr>
+          <w:lang w:val="en-US"/>
+        </w:rPr>
+        <w:t>Adafruit, but</w:t>
+      </w:r>
+      <w:proofErr w:type="gramEnd"/>
+      <w:r>
+        <w:rPr>
+          <w:lang w:val="en-US"/>
+        </w:rPr>
+        <w:t xml:space="preserve"> is too small and will not fit within the enclosure.</w:t>
       </w:r>
     </w:p>
     <w:p>
@@ -2647,6 +2702,7 @@
       </w:pPr>
       <w:bookmarkStart w:id="4" w:name="_Toc222389382"/>
       <w:r>
+        <w:lastRenderedPageBreak/>
         <w:t>Tool List</w:t>
       </w:r>
       <w:bookmarkEnd w:id="4"/>
@@ -3056,7 +3112,21 @@
         <w:rPr>
           <w:lang w:val="en-US"/>
         </w:rPr>
-        <w:t>The device outputs can be changed to better suit the user’s needs</w:t>
+        <w:t xml:space="preserve">The </w:t>
+      </w:r>
+      <w:proofErr w:type="gramStart"/>
+      <w:r>
+        <w:rPr>
+          <w:lang w:val="en-US"/>
+        </w:rPr>
+        <w:t>device</w:t>
+      </w:r>
+      <w:proofErr w:type="gramEnd"/>
+      <w:r>
+        <w:rPr>
+          <w:lang w:val="en-US"/>
+        </w:rPr>
+        <w:t xml:space="preserve"> outputs can be changed to better suit the user’s needs</w:t>
       </w:r>
     </w:p>
     <w:p>
@@ -3093,12 +3163,14 @@
         </w:rPr>
         <w:t xml:space="preserve">using </w:t>
       </w:r>
+      <w:proofErr w:type="spellStart"/>
       <w:r>
         <w:rPr>
           <w:lang w:val="en-US"/>
         </w:rPr>
         <w:t>BambuStudio</w:t>
       </w:r>
+      <w:proofErr w:type="spellEnd"/>
       <w:r>
         <w:rPr>
           <w:lang w:val="en-US"/>
@@ -3197,6 +3269,8 @@
               </w:rPr>
               <w:t>Total Print Time (</w:t>
             </w:r>
+            <w:proofErr w:type="spellStart"/>
+            <w:proofErr w:type="gramStart"/>
             <w:r>
               <w:rPr>
                 <w:lang w:val="en-US"/>
@@ -3213,7 +3287,15 @@
               <w:rPr>
                 <w:lang w:val="en-US"/>
               </w:rPr>
-              <w:t>min)</w:t>
+              <w:t>min</w:t>
+            </w:r>
+            <w:proofErr w:type="spellEnd"/>
+            <w:proofErr w:type="gramEnd"/>
+            <w:r>
+              <w:rPr>
+                <w:lang w:val="en-US"/>
+              </w:rPr>
+              <w:t>)</w:t>
             </w:r>
           </w:p>
         </w:tc>
@@ -3473,6 +3555,8 @@
               </w:rPr>
               <w:t>Print Time (</w:t>
             </w:r>
+            <w:proofErr w:type="spellStart"/>
+            <w:proofErr w:type="gramStart"/>
             <w:r>
               <w:rPr>
                 <w:b/>
@@ -3485,7 +3569,16 @@
                 <w:b/>
                 <w:lang w:val="en-US"/>
               </w:rPr>
-              <w:t>min)</w:t>
+              <w:t>min</w:t>
+            </w:r>
+            <w:proofErr w:type="spellEnd"/>
+            <w:proofErr w:type="gramEnd"/>
+            <w:r>
+              <w:rPr>
+                <w:b/>
+                <w:lang w:val="en-US"/>
+              </w:rPr>
+              <w:t>)</w:t>
             </w:r>
           </w:p>
         </w:tc>
@@ -3637,7 +3730,14 @@
               <w:rPr>
                 <w:lang w:val="en-US"/>
               </w:rPr>
-              <w:t>Shrub Hub Base</w:t>
+              <w:t xml:space="preserve">Shrub Hub </w:t>
+            </w:r>
+            <w:proofErr w:type="spellStart"/>
+            <w:r>
+              <w:rPr>
+                <w:lang w:val="en-US"/>
+              </w:rPr>
+              <w:t>Base</w:t>
             </w:r>
             <w:r>
               <w:rPr>
@@ -3651,6 +3751,7 @@
               </w:rPr>
               <w:t>stl</w:t>
             </w:r>
+            <w:proofErr w:type="spellEnd"/>
           </w:p>
         </w:tc>
         <w:tc>
@@ -3810,7 +3911,14 @@
               <w:rPr>
                 <w:lang w:val="en-US"/>
               </w:rPr>
-              <w:t>Shrub Hub Lid</w:t>
+              <w:t xml:space="preserve">Shrub Hub </w:t>
+            </w:r>
+            <w:proofErr w:type="spellStart"/>
+            <w:r>
+              <w:rPr>
+                <w:lang w:val="en-US"/>
+              </w:rPr>
+              <w:t>Lid</w:t>
             </w:r>
             <w:r>
               <w:rPr>
@@ -3818,6 +3926,7 @@
               </w:rPr>
               <w:t>.stl</w:t>
             </w:r>
+            <w:proofErr w:type="spellEnd"/>
           </w:p>
         </w:tc>
         <w:tc>
@@ -3971,7 +4080,14 @@
               <w:rPr>
                 <w:lang w:val="en-US"/>
               </w:rPr>
-              <w:t xml:space="preserve"> B</w:t>
+              <w:t xml:space="preserve"> </w:t>
+            </w:r>
+            <w:proofErr w:type="spellStart"/>
+            <w:r>
+              <w:rPr>
+                <w:lang w:val="en-US"/>
+              </w:rPr>
+              <w:t>B</w:t>
             </w:r>
             <w:r>
               <w:rPr>
@@ -3985,6 +4101,7 @@
               </w:rPr>
               <w:t>.stl</w:t>
             </w:r>
+            <w:proofErr w:type="spellEnd"/>
           </w:p>
         </w:tc>
         <w:tc>
@@ -4138,8 +4255,16 @@
               <w:rPr>
                 <w:lang w:val="en-US"/>
               </w:rPr>
-              <w:t xml:space="preserve"> Top.stl</w:t>
-            </w:r>
+              <w:t xml:space="preserve"> </w:t>
+            </w:r>
+            <w:proofErr w:type="spellStart"/>
+            <w:r>
+              <w:rPr>
+                <w:lang w:val="en-US"/>
+              </w:rPr>
+              <w:t>Top.stl</w:t>
+            </w:r>
+            <w:proofErr w:type="spellEnd"/>
           </w:p>
         </w:tc>
         <w:tc>
@@ -4771,6 +4896,7 @@
       </w:pPr>
       <w:bookmarkStart w:id="14" w:name="_Toc222389390"/>
       <w:r>
+        <w:lastRenderedPageBreak/>
         <w:t>Maker Component List</w:t>
       </w:r>
       <w:bookmarkEnd w:id="14"/>
@@ -6221,6 +6347,7 @@
       </w:pPr>
       <w:bookmarkStart w:id="15" w:name="_Toc222389391"/>
       <w:r>
+        <w:lastRenderedPageBreak/>
         <w:t>Assembly Guide</w:t>
       </w:r>
       <w:bookmarkEnd w:id="15"/>
@@ -6505,6 +6632,7 @@
         <w:pStyle w:val="Heading4"/>
       </w:pPr>
       <w:r>
+        <w:lastRenderedPageBreak/>
         <w:t xml:space="preserve">Step </w:t>
       </w:r>
       <w:r>
@@ -6705,6 +6833,7 @@
       </w:pPr>
       <w:bookmarkStart w:id="21" w:name="_Toc222389395"/>
       <w:r>
+        <w:lastRenderedPageBreak/>
         <w:t>Part B: Assembl</w:t>
       </w:r>
       <w:r>
@@ -7241,6 +7370,7 @@
         <w:pStyle w:val="Heading4"/>
       </w:pPr>
       <w:r>
+        <w:lastRenderedPageBreak/>
         <w:t xml:space="preserve">Step </w:t>
       </w:r>
       <w:r>
@@ -7711,6 +7841,7 @@
       </w:pPr>
       <w:bookmarkStart w:id="24" w:name="_Toc222389398"/>
       <w:r>
+        <w:lastRenderedPageBreak/>
         <w:t xml:space="preserve">Part </w:t>
       </w:r>
       <w:r>
@@ -7858,8 +7989,13 @@
         <w:t>-02:</w:t>
       </w:r>
       <w:r>
-        <w:t xml:space="preserve"> Install CircuitPython</w:t>
-      </w:r>
+        <w:t xml:space="preserve"> Install </w:t>
+      </w:r>
+      <w:proofErr w:type="spellStart"/>
+      <w:r>
+        <w:t>CircuitPython</w:t>
+      </w:r>
+      <w:proofErr w:type="spellEnd"/>
     </w:p>
     <w:p>
       <w:pPr>
@@ -7903,7 +8039,15 @@
         <w:t>A drive called TRINKEYBOOT should appear</w:t>
       </w:r>
       <w:r>
-        <w:t>, similar to plugging in a USB flash drive</w:t>
+        <w:t xml:space="preserve">, </w:t>
+      </w:r>
+      <w:proofErr w:type="gramStart"/>
+      <w:r>
+        <w:t>similar to</w:t>
+      </w:r>
+      <w:proofErr w:type="gramEnd"/>
+      <w:r>
+        <w:t xml:space="preserve"> plugging in a USB flash drive</w:t>
       </w:r>
       <w:r>
         <w:t xml:space="preserve">. </w:t>
@@ -7918,7 +8062,23 @@
         </w:numPr>
       </w:pPr>
       <w:r>
-        <w:t>Open the folder in the /Build_Files/Firmware_Files/Bootloader directory</w:t>
+        <w:t>Open the folder in the /</w:t>
+      </w:r>
+      <w:proofErr w:type="spellStart"/>
+      <w:r>
+        <w:t>Build_Files</w:t>
+      </w:r>
+      <w:proofErr w:type="spellEnd"/>
+      <w:r>
+        <w:t>/</w:t>
+      </w:r>
+      <w:proofErr w:type="spellStart"/>
+      <w:r>
+        <w:t>Firmware_Files</w:t>
+      </w:r>
+      <w:proofErr w:type="spellEnd"/>
+      <w:r>
+        <w:t>/Bootloader directory</w:t>
       </w:r>
       <w:r>
         <w:t xml:space="preserve"> in the project files</w:t>
@@ -7939,16 +8099,24 @@
         <w:t>Drag and drop the</w:t>
       </w:r>
       <w:r>
-        <w:t xml:space="preserve"> provided</w:t>
-      </w:r>
-      <w:r>
         <w:t xml:space="preserve"> </w:t>
       </w:r>
+      <w:proofErr w:type="gramStart"/>
+      <w:r>
+        <w:t>provided</w:t>
+      </w:r>
+      <w:r>
+        <w:t xml:space="preserve"> </w:t>
+      </w:r>
       <w:r>
         <w:t>.u</w:t>
       </w:r>
       <w:r>
-        <w:t>f2</w:t>
+        <w:t>f</w:t>
+      </w:r>
+      <w:proofErr w:type="gramEnd"/>
+      <w:r>
+        <w:t>2</w:t>
       </w:r>
       <w:r>
         <w:t xml:space="preserve"> file into the drive. It should then </w:t>
@@ -7995,8 +8163,21 @@
         <w:t xml:space="preserve">the lib folder in the </w:t>
       </w:r>
       <w:r>
-        <w:t>/Build_Files/Firmware_Files</w:t>
-      </w:r>
+        <w:t>/</w:t>
+      </w:r>
+      <w:proofErr w:type="spellStart"/>
+      <w:r>
+        <w:t>Build_Files</w:t>
+      </w:r>
+      <w:proofErr w:type="spellEnd"/>
+      <w:r>
+        <w:t>/</w:t>
+      </w:r>
+      <w:proofErr w:type="spellStart"/>
+      <w:r>
+        <w:t>Firmware_Files</w:t>
+      </w:r>
+      <w:proofErr w:type="spellEnd"/>
       <w:r>
         <w:t>/</w:t>
       </w:r>
@@ -8092,9 +8273,97 @@
     </w:p>
     <w:p>
       <w:pPr>
+        <w:ind w:left="360"/>
+        <w:rPr>
+          <w:b/>
+          <w:bCs/>
+        </w:rPr>
+      </w:pPr>
+      <w:r>
+        <w:rPr>
+          <w:b/>
+          <w:bCs/>
+        </w:rPr>
+        <w:t xml:space="preserve">Note: If you downloaded individual files instead of </w:t>
+      </w:r>
+      <w:r>
+        <w:rPr>
+          <w:b/>
+          <w:bCs/>
+        </w:rPr>
+        <w:t>the entire project repository, it is recommended to download the repository for this step.</w:t>
+      </w:r>
+      <w:r>
+        <w:rPr>
+          <w:b/>
+          <w:bCs/>
+        </w:rPr>
+        <w:t xml:space="preserve"> Copying the contents of the folder onto the Shrub Hub is much easier than downloading each file individually and recreating the file structure </w:t>
+      </w:r>
+      <w:r>
+        <w:rPr>
+          <w:b/>
+          <w:bCs/>
+        </w:rPr>
+        <w:t>yourself.</w:t>
+      </w:r>
+      <w:r>
+        <w:rPr>
+          <w:b/>
+          <w:bCs/>
+        </w:rPr>
+        <w:t xml:space="preserve"> The </w:t>
+      </w:r>
+      <w:r>
+        <w:rPr>
+          <w:b/>
+          <w:bCs/>
+        </w:rPr>
+        <w:t>repository can be downloaded from the device listing on the MMC website or by clicking on the</w:t>
+      </w:r>
+      <w:r>
+        <w:rPr>
+          <w:b/>
+          <w:bCs/>
+        </w:rPr>
+        <w:t xml:space="preserve"> green</w:t>
+      </w:r>
+      <w:r>
+        <w:rPr>
+          <w:b/>
+          <w:bCs/>
+        </w:rPr>
+        <w:t xml:space="preserve"> </w:t>
+      </w:r>
+      <w:r>
+        <w:rPr>
+          <w:b/>
+          <w:bCs/>
+        </w:rPr>
+        <w:t>&lt;&gt;Code button on the Shrub Hub GitHub page then the Download Zip button on the popup.</w:t>
+      </w:r>
+    </w:p>
+    <w:p>
+      <w:pPr>
+        <w:rPr>
+          <w:rFonts w:asciiTheme="majorHAnsi" w:eastAsiaTheme="majorEastAsia" w:hAnsiTheme="majorHAnsi" w:cstheme="majorBidi"/>
+          <w:b/>
+          <w:bCs/>
+          <w:i/>
+          <w:iCs/>
+          <w:color w:val="26225E" w:themeColor="accent1"/>
+        </w:rPr>
+      </w:pPr>
+      <w:r>
+        <w:br w:type="page"/>
+      </w:r>
+    </w:p>
+    <w:p>
+      <w:pPr>
         <w:pStyle w:val="Heading4"/>
       </w:pPr>
       <w:r>
+        <w:lastRenderedPageBreak/>
         <w:t xml:space="preserve">Step </w:t>
       </w:r>
       <w:r>
@@ -8119,8 +8388,21 @@
         </w:numPr>
       </w:pPr>
       <w:r>
-        <w:t>Copy the code.py file from the /Build_Files/Firmware_Files</w:t>
-      </w:r>
+        <w:t>Copy the code.py file from the /</w:t>
+      </w:r>
+      <w:proofErr w:type="spellStart"/>
+      <w:r>
+        <w:t>Build_Files</w:t>
+      </w:r>
+      <w:proofErr w:type="spellEnd"/>
+      <w:r>
+        <w:t>/</w:t>
+      </w:r>
+      <w:proofErr w:type="spellStart"/>
+      <w:r>
+        <w:t>Firmware_Files</w:t>
+      </w:r>
+      <w:proofErr w:type="spellEnd"/>
       <w:r>
         <w:t>/Shrub Hub Firmware</w:t>
       </w:r>
@@ -8157,7 +8439,15 @@
     <w:p>
       <w:bookmarkStart w:id="27" w:name="_Toc222389401"/>
       <w:r>
-        <w:t>The outputs of each mode can be changed to better suit the needs of the user. The instructions for how to do this can be found in the Changing Outputs Guide in the Shrub Hub documentation folder. This requires opening and modifying the code, and should only be done by someone who is confident in their ability.</w:t>
+        <w:t xml:space="preserve">The outputs of each mode can be changed to better suit the needs of the user. The instructions for how to do this can be found in the Changing Outputs Guide in the Shrub Hub documentation folder. This requires opening and modifying the </w:t>
+      </w:r>
+      <w:proofErr w:type="gramStart"/>
+      <w:r>
+        <w:t>code, and</w:t>
+      </w:r>
+      <w:proofErr w:type="gramEnd"/>
+      <w:r>
+        <w:t xml:space="preserve"> should only be done by someone who is confident in their ability.</w:t>
       </w:r>
     </w:p>
     <w:p>
@@ -8181,6 +8471,7 @@
         <w:pStyle w:val="Heading1"/>
       </w:pPr>
       <w:r>
+        <w:lastRenderedPageBreak/>
         <w:t>Testing</w:t>
       </w:r>
       <w:r>
@@ -9691,6 +9982,7 @@
       </w:pPr>
       <w:bookmarkStart w:id="29" w:name="_Toc222389402"/>
       <w:r>
+        <w:lastRenderedPageBreak/>
         <w:t>Troubleshooting</w:t>
       </w:r>
       <w:r>
@@ -10553,7 +10845,21 @@
               <w:rPr>
                 <w:lang w:val="en-US"/>
               </w:rPr>
-              <w:t xml:space="preserve"> short between two of the cables</w:t>
+              <w:t xml:space="preserve"> </w:t>
+            </w:r>
+            <w:proofErr w:type="gramStart"/>
+            <w:r>
+              <w:rPr>
+                <w:lang w:val="en-US"/>
+              </w:rPr>
+              <w:t>short</w:t>
+            </w:r>
+            <w:proofErr w:type="gramEnd"/>
+            <w:r>
+              <w:rPr>
+                <w:lang w:val="en-US"/>
+              </w:rPr>
+              <w:t xml:space="preserve"> between two of the cables</w:t>
             </w:r>
             <w:r>
               <w:rPr>
@@ -10595,6 +10901,7 @@
       </w:pPr>
       <w:bookmarkStart w:id="31" w:name="_Toc222389403"/>
       <w:r>
+        <w:lastRenderedPageBreak/>
         <w:t>Support and Resources</w:t>
       </w:r>
       <w:bookmarkEnd w:id="30"/>
@@ -10639,6 +10946,12 @@
     <w:p>
       <w:pPr>
         <w:rPr>
+          <w:rFonts w:eastAsiaTheme="majorEastAsia" w:cstheme="majorBidi"/>
+          <w:b/>
+          <w:bCs/>
+          <w:color w:val="1C1946" w:themeColor="accent1" w:themeShade="BF"/>
+          <w:sz w:val="28"/>
+          <w:szCs w:val="28"/>
           <w:lang w:val="en-US"/>
         </w:rPr>
       </w:pPr>
@@ -10684,6 +10997,17 @@
         <w:fldChar w:fldCharType="separate"/>
       </w:r>
       <w:r>
+        <w:br w:type="page"/>
+      </w:r>
+    </w:p>
+    <w:p>
+      <w:pPr>
+        <w:rPr>
+          <w:lang w:val="en-US"/>
+        </w:rPr>
+      </w:pPr>
+      <w:r>
+        <w:lastRenderedPageBreak/>
         <w:t>Troubleshooting Guide</w:t>
       </w:r>
       <w:r>
@@ -10875,7 +11199,21 @@
         <w:rPr>
           <w:lang w:val="fr-FR"/>
         </w:rPr>
-        <w:t xml:space="preserve">Project page: </w:t>
+        <w:t xml:space="preserve">Project </w:t>
+      </w:r>
+      <w:proofErr w:type="gramStart"/>
+      <w:r>
+        <w:rPr>
+          <w:lang w:val="fr-FR"/>
+        </w:rPr>
+        <w:t>page:</w:t>
+      </w:r>
+      <w:proofErr w:type="gramEnd"/>
+      <w:r>
+        <w:rPr>
+          <w:lang w:val="fr-FR"/>
+        </w:rPr>
+        <w:t xml:space="preserve"> </w:t>
       </w:r>
       <w:hyperlink r:id="rId39" w:history="1">
         <w:r>

</xml_diff>